<commit_message>
poster updaate for meeting
</commit_message>
<xml_diff>
--- a/keelinjoyce/rowing/Erging_ConfidenceIntervals.docx
+++ b/keelinjoyce/rowing/Erging_ConfidenceIntervals.docx
@@ -4,6 +4,7 @@
   <w:body>
     <w:p>
       <w:pPr>
+        <w:jc w:val="left"/>
         <w:rPr>
           <w:rFonts w:ascii="Calibri" w:hAnsi="Calibri" w:cs="Calibri"/>
           <w:sz w:val="21"/>
@@ -140,6 +141,7 @@
           <w:ilvl w:val="0"/>
           <w:numId w:val="7"/>
         </w:numPr>
+        <w:jc w:val="left"/>
         <w:rPr>
           <w:rFonts w:ascii="Calibri" w:hAnsi="Calibri" w:cs="Calibri"/>
           <w:sz w:val="21"/>
@@ -167,6 +169,7 @@
       <w:pPr>
         <w:pStyle w:val="ListParagraph"/>
         <w:ind w:left="360"/>
+        <w:jc w:val="left"/>
         <w:rPr>
           <w:rFonts w:ascii="Calibri" w:hAnsi="Calibri" w:cs="Calibri"/>
           <w:sz w:val="21"/>
@@ -218,6 +221,7 @@
       <w:pPr>
         <w:pStyle w:val="ListParagraph"/>
         <w:ind w:left="810"/>
+        <w:jc w:val="left"/>
         <w:rPr>
           <w:rFonts w:ascii="Calibri" w:hAnsi="Calibri" w:cs="Calibri"/>
           <w:sz w:val="21"/>
@@ -233,6 +237,7 @@
           <w:numId w:val="5"/>
         </w:numPr>
         <w:ind w:left="810"/>
+        <w:jc w:val="left"/>
         <w:rPr>
           <w:rFonts w:ascii="Calibri" w:hAnsi="Calibri" w:cs="Calibri"/>
           <w:sz w:val="21"/>
@@ -252,17 +257,19 @@
       <w:pPr>
         <w:pStyle w:val="ListParagraph"/>
         <w:ind w:left="810"/>
-        <w:rPr>
-          <w:rFonts w:ascii="Calibri" w:hAnsi="Calibri" w:cs="Calibri"/>
-          <w:sz w:val="21"/>
-          <w:szCs w:val="21"/>
-        </w:rPr>
-      </w:pPr>
-    </w:p>
-    <w:p>
-      <w:pPr>
-        <w:pStyle w:val="ListParagraph"/>
-        <w:ind w:left="810"/>
+        <w:jc w:val="left"/>
+        <w:rPr>
+          <w:rFonts w:ascii="Calibri" w:hAnsi="Calibri" w:cs="Calibri"/>
+          <w:sz w:val="21"/>
+          <w:szCs w:val="21"/>
+        </w:rPr>
+      </w:pPr>
+    </w:p>
+    <w:p>
+      <w:pPr>
+        <w:pStyle w:val="ListParagraph"/>
+        <w:ind w:left="810"/>
+        <w:jc w:val="left"/>
         <w:rPr>
           <w:rFonts w:ascii="Calibri" w:hAnsi="Calibri" w:cs="Calibri"/>
           <w:i/>
@@ -277,6 +284,7 @@
       <w:pPr>
         <w:pStyle w:val="ListParagraph"/>
         <w:ind w:left="810"/>
+        <w:jc w:val="left"/>
         <w:rPr>
           <w:rFonts w:ascii="Calibri" w:hAnsi="Calibri" w:cs="Calibri"/>
           <w:sz w:val="21"/>
@@ -292,6 +300,7 @@
           <w:numId w:val="5"/>
         </w:numPr>
         <w:ind w:left="810"/>
+        <w:jc w:val="left"/>
         <w:rPr>
           <w:rFonts w:ascii="Calibri" w:hAnsi="Calibri" w:cs="Calibri"/>
           <w:sz w:val="21"/>
@@ -367,17 +376,19 @@
       <w:pPr>
         <w:pStyle w:val="ListParagraph"/>
         <w:ind w:left="810"/>
-        <w:rPr>
-          <w:rFonts w:ascii="Calibri" w:hAnsi="Calibri" w:cs="Calibri"/>
-          <w:sz w:val="21"/>
-          <w:szCs w:val="21"/>
-        </w:rPr>
-      </w:pPr>
-    </w:p>
-    <w:p>
-      <w:pPr>
-        <w:pStyle w:val="ListParagraph"/>
-        <w:ind w:left="810"/>
+        <w:jc w:val="left"/>
+        <w:rPr>
+          <w:rFonts w:ascii="Calibri" w:hAnsi="Calibri" w:cs="Calibri"/>
+          <w:sz w:val="21"/>
+          <w:szCs w:val="21"/>
+        </w:rPr>
+      </w:pPr>
+    </w:p>
+    <w:p>
+      <w:pPr>
+        <w:pStyle w:val="ListParagraph"/>
+        <w:ind w:left="810"/>
+        <w:jc w:val="left"/>
         <w:rPr>
           <w:rFonts w:ascii="Calibri" w:hAnsi="Calibri" w:cs="Calibri"/>
           <w:sz w:val="21"/>
@@ -393,6 +404,7 @@
           <w:numId w:val="5"/>
         </w:numPr>
         <w:ind w:left="810"/>
+        <w:jc w:val="left"/>
         <w:rPr>
           <w:rFonts w:ascii="Calibri" w:hAnsi="Calibri" w:cs="Calibri"/>
           <w:sz w:val="21"/>
@@ -438,17 +450,19 @@
       <w:pPr>
         <w:pStyle w:val="ListParagraph"/>
         <w:ind w:left="810"/>
-        <w:rPr>
-          <w:rFonts w:ascii="Calibri" w:hAnsi="Calibri" w:cs="Calibri"/>
-          <w:sz w:val="21"/>
-          <w:szCs w:val="21"/>
-        </w:rPr>
-      </w:pPr>
-    </w:p>
-    <w:p>
-      <w:pPr>
-        <w:pStyle w:val="ListParagraph"/>
-        <w:ind w:left="810"/>
+        <w:jc w:val="left"/>
+        <w:rPr>
+          <w:rFonts w:ascii="Calibri" w:hAnsi="Calibri" w:cs="Calibri"/>
+          <w:sz w:val="21"/>
+          <w:szCs w:val="21"/>
+        </w:rPr>
+      </w:pPr>
+    </w:p>
+    <w:p>
+      <w:pPr>
+        <w:pStyle w:val="ListParagraph"/>
+        <w:ind w:left="810"/>
+        <w:jc w:val="left"/>
         <w:rPr>
           <w:rFonts w:ascii="Calibri" w:hAnsi="Calibri" w:cs="Calibri"/>
           <w:color w:val="FF0000"/>
@@ -461,6 +475,7 @@
       <w:pPr>
         <w:pStyle w:val="ListParagraph"/>
         <w:ind w:left="810"/>
+        <w:jc w:val="left"/>
         <w:rPr>
           <w:rFonts w:ascii="Calibri" w:hAnsi="Calibri" w:cs="Calibri"/>
           <w:color w:val="FF0000"/>
@@ -473,6 +488,7 @@
       <w:pPr>
         <w:pStyle w:val="ListParagraph"/>
         <w:ind w:left="810"/>
+        <w:jc w:val="left"/>
         <w:rPr>
           <w:rFonts w:ascii="Calibri" w:hAnsi="Calibri" w:cs="Calibri"/>
           <w:sz w:val="21"/>
@@ -488,6 +504,7 @@
           <w:numId w:val="5"/>
         </w:numPr>
         <w:ind w:left="810"/>
+        <w:jc w:val="left"/>
         <w:rPr>
           <w:rFonts w:ascii="Calibri" w:hAnsi="Calibri" w:cs="Calibri"/>
           <w:sz w:val="21"/>
@@ -506,6 +523,7 @@
     <w:p>
       <w:pPr>
         <w:pStyle w:val="ListParagraph"/>
+        <w:jc w:val="left"/>
         <w:rPr>
           <w:rFonts w:ascii="Calibri" w:hAnsi="Calibri" w:cs="Calibri"/>
           <w:sz w:val="21"/>
@@ -520,6 +538,7 @@
           <w:ilvl w:val="0"/>
           <w:numId w:val="6"/>
         </w:numPr>
+        <w:jc w:val="left"/>
         <w:rPr>
           <w:rFonts w:ascii="Calibri" w:hAnsi="Calibri" w:cs="Calibri"/>
           <w:sz w:val="21"/>
@@ -542,6 +561,7 @@
           <w:ilvl w:val="0"/>
           <w:numId w:val="6"/>
         </w:numPr>
+        <w:jc w:val="left"/>
         <w:rPr>
           <w:rFonts w:ascii="Calibri" w:hAnsi="Calibri" w:cs="Calibri"/>
           <w:sz w:val="21"/>
@@ -564,6 +584,7 @@
           <w:ilvl w:val="1"/>
           <w:numId w:val="6"/>
         </w:numPr>
+        <w:jc w:val="left"/>
         <w:rPr>
           <w:rFonts w:ascii="Calibri" w:eastAsiaTheme="minorHAnsi" w:hAnsi="Calibri" w:cs="Calibri"/>
           <w:sz w:val="21"/>
@@ -618,6 +639,7 @@
           <w:ilvl w:val="1"/>
           <w:numId w:val="6"/>
         </w:numPr>
+        <w:jc w:val="left"/>
         <w:rPr>
           <w:rFonts w:ascii="Calibri" w:hAnsi="Calibri" w:cs="Calibri"/>
           <w:sz w:val="21"/>
@@ -703,6 +725,7 @@
           <w:numId w:val="5"/>
         </w:numPr>
         <w:ind w:left="810"/>
+        <w:jc w:val="left"/>
         <w:rPr>
           <w:rFonts w:ascii="Calibri" w:hAnsi="Calibri" w:cs="Calibri"/>
           <w:sz w:val="21"/>
@@ -754,127 +777,139 @@
       <w:pPr>
         <w:pStyle w:val="ListParagraph"/>
         <w:ind w:left="810"/>
-        <w:rPr>
-          <w:rFonts w:ascii="Calibri" w:hAnsi="Calibri" w:cs="Calibri"/>
-          <w:sz w:val="21"/>
-          <w:szCs w:val="21"/>
-        </w:rPr>
-      </w:pPr>
-    </w:p>
-    <w:p>
-      <w:pPr>
-        <w:pStyle w:val="ListParagraph"/>
-        <w:ind w:left="810"/>
-        <w:rPr>
-          <w:rFonts w:ascii="Calibri" w:hAnsi="Calibri" w:cs="Calibri"/>
-          <w:sz w:val="21"/>
-          <w:szCs w:val="21"/>
-        </w:rPr>
-      </w:pPr>
-    </w:p>
-    <w:p>
-      <w:pPr>
-        <w:pStyle w:val="ListParagraph"/>
-        <w:ind w:left="810"/>
-        <w:rPr>
-          <w:rFonts w:ascii="Calibri" w:hAnsi="Calibri" w:cs="Calibri"/>
-          <w:sz w:val="21"/>
-          <w:szCs w:val="21"/>
-        </w:rPr>
-      </w:pPr>
-    </w:p>
-    <w:p>
-      <w:pPr>
-        <w:pStyle w:val="ListParagraph"/>
-        <w:ind w:left="810"/>
-        <w:rPr>
-          <w:rFonts w:ascii="Calibri" w:hAnsi="Calibri" w:cs="Calibri"/>
-          <w:sz w:val="21"/>
-          <w:szCs w:val="21"/>
-        </w:rPr>
-      </w:pPr>
-    </w:p>
-    <w:p>
-      <w:pPr>
-        <w:pStyle w:val="ListParagraph"/>
-        <w:ind w:left="810"/>
-        <w:rPr>
-          <w:rFonts w:ascii="Calibri" w:hAnsi="Calibri" w:cs="Calibri"/>
-          <w:sz w:val="21"/>
-          <w:szCs w:val="21"/>
-        </w:rPr>
-      </w:pPr>
-    </w:p>
-    <w:p>
-      <w:pPr>
-        <w:pStyle w:val="ListParagraph"/>
-        <w:ind w:left="810"/>
-        <w:rPr>
-          <w:rFonts w:ascii="Calibri" w:hAnsi="Calibri" w:cs="Calibri"/>
-          <w:sz w:val="21"/>
-          <w:szCs w:val="21"/>
-        </w:rPr>
-      </w:pPr>
-    </w:p>
-    <w:p>
-      <w:pPr>
-        <w:pStyle w:val="ListParagraph"/>
-        <w:ind w:left="810"/>
-        <w:rPr>
-          <w:rFonts w:ascii="Calibri" w:hAnsi="Calibri" w:cs="Calibri"/>
-          <w:sz w:val="21"/>
-          <w:szCs w:val="21"/>
-        </w:rPr>
-      </w:pPr>
-    </w:p>
-    <w:p>
-      <w:pPr>
-        <w:pStyle w:val="ListParagraph"/>
-        <w:ind w:left="810"/>
-        <w:rPr>
-          <w:rFonts w:ascii="Calibri" w:hAnsi="Calibri" w:cs="Calibri"/>
-          <w:sz w:val="21"/>
-          <w:szCs w:val="21"/>
-        </w:rPr>
-      </w:pPr>
-    </w:p>
-    <w:p>
-      <w:pPr>
-        <w:pStyle w:val="ListParagraph"/>
-        <w:ind w:left="810"/>
-        <w:rPr>
-          <w:rFonts w:ascii="Calibri" w:hAnsi="Calibri" w:cs="Calibri"/>
-          <w:sz w:val="21"/>
-          <w:szCs w:val="21"/>
-        </w:rPr>
-      </w:pPr>
-    </w:p>
-    <w:p>
-      <w:pPr>
-        <w:pStyle w:val="ListParagraph"/>
-        <w:ind w:left="810"/>
-        <w:rPr>
-          <w:rFonts w:ascii="Calibri" w:hAnsi="Calibri" w:cs="Calibri"/>
-          <w:sz w:val="21"/>
-          <w:szCs w:val="21"/>
-        </w:rPr>
-      </w:pPr>
-    </w:p>
-    <w:p>
-      <w:pPr>
-        <w:pStyle w:val="ListParagraph"/>
-        <w:ind w:left="810"/>
-        <w:rPr>
-          <w:rFonts w:ascii="Calibri" w:hAnsi="Calibri" w:cs="Calibri"/>
-          <w:sz w:val="21"/>
-          <w:szCs w:val="21"/>
-        </w:rPr>
-      </w:pPr>
-    </w:p>
-    <w:p>
-      <w:pPr>
-        <w:pStyle w:val="ListParagraph"/>
-        <w:ind w:left="810"/>
+        <w:jc w:val="left"/>
+        <w:rPr>
+          <w:rFonts w:ascii="Calibri" w:hAnsi="Calibri" w:cs="Calibri"/>
+          <w:sz w:val="21"/>
+          <w:szCs w:val="21"/>
+        </w:rPr>
+      </w:pPr>
+    </w:p>
+    <w:p>
+      <w:pPr>
+        <w:pStyle w:val="ListParagraph"/>
+        <w:ind w:left="810"/>
+        <w:jc w:val="left"/>
+        <w:rPr>
+          <w:rFonts w:ascii="Calibri" w:hAnsi="Calibri" w:cs="Calibri"/>
+          <w:sz w:val="21"/>
+          <w:szCs w:val="21"/>
+        </w:rPr>
+      </w:pPr>
+    </w:p>
+    <w:p>
+      <w:pPr>
+        <w:pStyle w:val="ListParagraph"/>
+        <w:ind w:left="810"/>
+        <w:jc w:val="left"/>
+        <w:rPr>
+          <w:rFonts w:ascii="Calibri" w:hAnsi="Calibri" w:cs="Calibri"/>
+          <w:sz w:val="21"/>
+          <w:szCs w:val="21"/>
+        </w:rPr>
+      </w:pPr>
+    </w:p>
+    <w:p>
+      <w:pPr>
+        <w:pStyle w:val="ListParagraph"/>
+        <w:ind w:left="810"/>
+        <w:jc w:val="left"/>
+        <w:rPr>
+          <w:rFonts w:ascii="Calibri" w:hAnsi="Calibri" w:cs="Calibri"/>
+          <w:sz w:val="21"/>
+          <w:szCs w:val="21"/>
+        </w:rPr>
+      </w:pPr>
+    </w:p>
+    <w:p>
+      <w:pPr>
+        <w:pStyle w:val="ListParagraph"/>
+        <w:ind w:left="810"/>
+        <w:jc w:val="left"/>
+        <w:rPr>
+          <w:rFonts w:ascii="Calibri" w:hAnsi="Calibri" w:cs="Calibri"/>
+          <w:sz w:val="21"/>
+          <w:szCs w:val="21"/>
+        </w:rPr>
+      </w:pPr>
+    </w:p>
+    <w:p>
+      <w:pPr>
+        <w:pStyle w:val="ListParagraph"/>
+        <w:ind w:left="810"/>
+        <w:jc w:val="left"/>
+        <w:rPr>
+          <w:rFonts w:ascii="Calibri" w:hAnsi="Calibri" w:cs="Calibri"/>
+          <w:sz w:val="21"/>
+          <w:szCs w:val="21"/>
+        </w:rPr>
+      </w:pPr>
+    </w:p>
+    <w:p>
+      <w:pPr>
+        <w:pStyle w:val="ListParagraph"/>
+        <w:ind w:left="810"/>
+        <w:jc w:val="left"/>
+        <w:rPr>
+          <w:rFonts w:ascii="Calibri" w:hAnsi="Calibri" w:cs="Calibri"/>
+          <w:sz w:val="21"/>
+          <w:szCs w:val="21"/>
+        </w:rPr>
+      </w:pPr>
+    </w:p>
+    <w:p>
+      <w:pPr>
+        <w:pStyle w:val="ListParagraph"/>
+        <w:ind w:left="810"/>
+        <w:jc w:val="left"/>
+        <w:rPr>
+          <w:rFonts w:ascii="Calibri" w:hAnsi="Calibri" w:cs="Calibri"/>
+          <w:sz w:val="21"/>
+          <w:szCs w:val="21"/>
+        </w:rPr>
+      </w:pPr>
+    </w:p>
+    <w:p>
+      <w:pPr>
+        <w:pStyle w:val="ListParagraph"/>
+        <w:ind w:left="810"/>
+        <w:jc w:val="left"/>
+        <w:rPr>
+          <w:rFonts w:ascii="Calibri" w:hAnsi="Calibri" w:cs="Calibri"/>
+          <w:sz w:val="21"/>
+          <w:szCs w:val="21"/>
+        </w:rPr>
+      </w:pPr>
+    </w:p>
+    <w:p>
+      <w:pPr>
+        <w:pStyle w:val="ListParagraph"/>
+        <w:ind w:left="810"/>
+        <w:jc w:val="left"/>
+        <w:rPr>
+          <w:rFonts w:ascii="Calibri" w:hAnsi="Calibri" w:cs="Calibri"/>
+          <w:sz w:val="21"/>
+          <w:szCs w:val="21"/>
+        </w:rPr>
+      </w:pPr>
+    </w:p>
+    <w:p>
+      <w:pPr>
+        <w:pStyle w:val="ListParagraph"/>
+        <w:ind w:left="810"/>
+        <w:jc w:val="left"/>
+        <w:rPr>
+          <w:rFonts w:ascii="Calibri" w:hAnsi="Calibri" w:cs="Calibri"/>
+          <w:sz w:val="21"/>
+          <w:szCs w:val="21"/>
+        </w:rPr>
+      </w:pPr>
+    </w:p>
+    <w:p>
+      <w:pPr>
+        <w:pStyle w:val="ListParagraph"/>
+        <w:ind w:left="810"/>
+        <w:jc w:val="left"/>
         <w:rPr>
           <w:sz w:val="21"/>
           <w:szCs w:val="21"/>
@@ -889,6 +924,7 @@
           <w:numId w:val="5"/>
         </w:numPr>
         <w:ind w:left="810"/>
+        <w:jc w:val="left"/>
         <w:rPr>
           <w:sz w:val="21"/>
           <w:szCs w:val="21"/>
@@ -907,26 +943,29 @@
       <w:pPr>
         <w:pStyle w:val="ListParagraph"/>
         <w:ind w:left="810"/>
-        <w:rPr>
-          <w:sz w:val="21"/>
-          <w:szCs w:val="21"/>
-        </w:rPr>
-      </w:pPr>
-    </w:p>
-    <w:p>
-      <w:pPr>
-        <w:pStyle w:val="ListParagraph"/>
-        <w:ind w:left="810"/>
-        <w:rPr>
-          <w:sz w:val="21"/>
-          <w:szCs w:val="21"/>
-        </w:rPr>
-      </w:pPr>
-    </w:p>
-    <w:p>
-      <w:pPr>
-        <w:pStyle w:val="ListParagraph"/>
-        <w:ind w:left="810"/>
+        <w:jc w:val="left"/>
+        <w:rPr>
+          <w:sz w:val="21"/>
+          <w:szCs w:val="21"/>
+        </w:rPr>
+      </w:pPr>
+    </w:p>
+    <w:p>
+      <w:pPr>
+        <w:pStyle w:val="ListParagraph"/>
+        <w:ind w:left="810"/>
+        <w:jc w:val="left"/>
+        <w:rPr>
+          <w:sz w:val="21"/>
+          <w:szCs w:val="21"/>
+        </w:rPr>
+      </w:pPr>
+    </w:p>
+    <w:p>
+      <w:pPr>
+        <w:pStyle w:val="ListParagraph"/>
+        <w:ind w:left="810"/>
+        <w:jc w:val="left"/>
         <w:rPr>
           <w:color w:val="FF0000"/>
           <w:sz w:val="21"/>
@@ -938,6 +977,7 @@
       <w:pPr>
         <w:pStyle w:val="ListParagraph"/>
         <w:ind w:left="810"/>
+        <w:jc w:val="left"/>
         <w:rPr>
           <w:sz w:val="21"/>
           <w:szCs w:val="21"/>
@@ -952,6 +992,7 @@
           <w:numId w:val="5"/>
         </w:numPr>
         <w:ind w:left="810"/>
+        <w:jc w:val="left"/>
         <w:rPr>
           <w:sz w:val="21"/>
           <w:szCs w:val="21"/>
@@ -976,26 +1017,29 @@
       <w:pPr>
         <w:pStyle w:val="ListParagraph"/>
         <w:ind w:left="810"/>
-        <w:rPr>
-          <w:sz w:val="21"/>
-          <w:szCs w:val="21"/>
-        </w:rPr>
-      </w:pPr>
-    </w:p>
-    <w:p>
-      <w:pPr>
-        <w:pStyle w:val="ListParagraph"/>
-        <w:ind w:left="810"/>
-        <w:rPr>
-          <w:sz w:val="21"/>
-          <w:szCs w:val="21"/>
-        </w:rPr>
-      </w:pPr>
-    </w:p>
-    <w:p>
-      <w:pPr>
-        <w:pStyle w:val="ListParagraph"/>
-        <w:ind w:left="810"/>
+        <w:jc w:val="left"/>
+        <w:rPr>
+          <w:sz w:val="21"/>
+          <w:szCs w:val="21"/>
+        </w:rPr>
+      </w:pPr>
+    </w:p>
+    <w:p>
+      <w:pPr>
+        <w:pStyle w:val="ListParagraph"/>
+        <w:ind w:left="810"/>
+        <w:jc w:val="left"/>
+        <w:rPr>
+          <w:sz w:val="21"/>
+          <w:szCs w:val="21"/>
+        </w:rPr>
+      </w:pPr>
+    </w:p>
+    <w:p>
+      <w:pPr>
+        <w:pStyle w:val="ListParagraph"/>
+        <w:ind w:left="810"/>
+        <w:jc w:val="left"/>
         <w:rPr>
           <w:color w:val="FF0000"/>
           <w:sz w:val="21"/>
@@ -1007,6 +1051,7 @@
       <w:pPr>
         <w:pStyle w:val="ListParagraph"/>
         <w:ind w:left="810"/>
+        <w:jc w:val="left"/>
         <w:rPr>
           <w:color w:val="FF0000"/>
           <w:sz w:val="21"/>
@@ -1018,6 +1063,7 @@
       <w:pPr>
         <w:pStyle w:val="ListParagraph"/>
         <w:ind w:left="810"/>
+        <w:jc w:val="left"/>
         <w:rPr>
           <w:color w:val="FF0000"/>
           <w:sz w:val="21"/>
@@ -1032,6 +1078,7 @@
           <w:ilvl w:val="0"/>
           <w:numId w:val="5"/>
         </w:numPr>
+        <w:jc w:val="left"/>
         <w:rPr>
           <w:rFonts w:cstheme="minorHAnsi"/>
           <w:sz w:val="21"/>
@@ -1066,6 +1113,7 @@
     <w:p>
       <w:pPr>
         <w:ind w:left="810"/>
+        <w:jc w:val="left"/>
         <w:rPr>
           <w:rFonts w:cstheme="minorHAnsi"/>
           <w:color w:val="FF0000"/>
@@ -1077,6 +1125,7 @@
     <w:p>
       <w:pPr>
         <w:ind w:left="810"/>
+        <w:jc w:val="left"/>
         <w:rPr>
           <w:rFonts w:cstheme="minorHAnsi"/>
           <w:color w:val="FF0000"/>
@@ -1088,6 +1137,7 @@
     <w:p>
       <w:pPr>
         <w:ind w:left="810"/>
+        <w:jc w:val="left"/>
         <w:rPr>
           <w:rFonts w:cstheme="minorHAnsi"/>
           <w:color w:val="FF0000"/>
@@ -1099,6 +1149,7 @@
     <w:p>
       <w:pPr>
         <w:ind w:left="810"/>
+        <w:jc w:val="left"/>
         <w:rPr>
           <w:rFonts w:cstheme="minorHAnsi"/>
           <w:color w:val="FF0000"/>
@@ -1110,6 +1161,7 @@
     <w:p>
       <w:pPr>
         <w:ind w:left="810"/>
+        <w:jc w:val="left"/>
         <w:rPr>
           <w:rFonts w:cstheme="minorHAnsi"/>
           <w:color w:val="FF0000"/>
@@ -1121,6 +1173,7 @@
     <w:p>
       <w:pPr>
         <w:ind w:left="810"/>
+        <w:jc w:val="left"/>
         <w:rPr>
           <w:rFonts w:cstheme="minorHAnsi"/>
           <w:color w:val="FF0000"/>
@@ -1132,6 +1185,7 @@
     <w:p>
       <w:pPr>
         <w:ind w:left="810"/>
+        <w:jc w:val="left"/>
         <w:rPr>
           <w:rFonts w:cstheme="minorHAnsi"/>
           <w:color w:val="FF0000"/>
@@ -1143,6 +1197,7 @@
     <w:p>
       <w:pPr>
         <w:ind w:left="810"/>
+        <w:jc w:val="left"/>
         <w:rPr>
           <w:rFonts w:cstheme="minorHAnsi"/>
           <w:color w:val="FF0000"/>
@@ -1154,6 +1209,7 @@
     <w:p>
       <w:pPr>
         <w:ind w:left="810"/>
+        <w:jc w:val="left"/>
         <w:rPr>
           <w:rFonts w:cstheme="minorHAnsi"/>
           <w:color w:val="FF0000"/>
@@ -1165,6 +1221,7 @@
     <w:p>
       <w:pPr>
         <w:ind w:left="810"/>
+        <w:jc w:val="left"/>
         <w:rPr>
           <w:rFonts w:cstheme="minorHAnsi"/>
           <w:color w:val="FF0000"/>
@@ -1176,6 +1233,7 @@
     <w:p>
       <w:pPr>
         <w:ind w:left="810"/>
+        <w:jc w:val="left"/>
         <w:rPr>
           <w:rFonts w:cstheme="minorHAnsi"/>
           <w:color w:val="FF0000"/>
@@ -1187,6 +1245,7 @@
     <w:p>
       <w:pPr>
         <w:ind w:left="810"/>
+        <w:jc w:val="left"/>
         <w:rPr>
           <w:rFonts w:cstheme="minorHAnsi"/>
           <w:color w:val="FF0000"/>
@@ -1198,6 +1257,7 @@
     <w:p>
       <w:pPr>
         <w:ind w:left="810"/>
+        <w:jc w:val="left"/>
         <w:rPr>
           <w:rFonts w:cstheme="minorHAnsi"/>
           <w:color w:val="FF0000"/>
@@ -1209,6 +1269,7 @@
     <w:p>
       <w:pPr>
         <w:ind w:left="810"/>
+        <w:jc w:val="left"/>
         <w:rPr>
           <w:rFonts w:ascii="Calibri" w:hAnsi="Calibri" w:cs="Calibri"/>
           <w:color w:val="000000" w:themeColor="text1"/>
@@ -1229,6 +1290,7 @@
     <w:p>
       <w:pPr>
         <w:ind w:left="810"/>
+        <w:jc w:val="left"/>
         <w:rPr>
           <w:rFonts w:ascii="Calibri" w:hAnsi="Calibri" w:cs="Calibri"/>
           <w:color w:val="FF0000"/>
@@ -1240,6 +1302,7 @@
     <w:p>
       <w:pPr>
         <w:ind w:left="810"/>
+        <w:jc w:val="left"/>
         <w:rPr>
           <w:rFonts w:ascii="Calibri" w:hAnsi="Calibri" w:cs="Calibri"/>
           <w:color w:val="000000" w:themeColor="text1"/>
@@ -1260,6 +1323,7 @@
     <w:p>
       <w:pPr>
         <w:ind w:left="810"/>
+        <w:jc w:val="left"/>
         <w:rPr>
           <w:rFonts w:ascii="Calibri" w:hAnsi="Calibri" w:cs="Calibri"/>
           <w:color w:val="FF0000"/>
@@ -1271,6 +1335,7 @@
     <w:p>
       <w:pPr>
         <w:ind w:left="810"/>
+        <w:jc w:val="left"/>
         <w:rPr>
           <w:rFonts w:ascii="Calibri" w:hAnsi="Calibri" w:cs="Calibri"/>
           <w:color w:val="FF0000"/>
@@ -2177,6 +2242,7 @@
     <w:lsdException w:name="HTML Sample" w:semiHidden="1" w:unhideWhenUsed="1"/>
     <w:lsdException w:name="HTML Typewriter" w:semiHidden="1" w:unhideWhenUsed="1"/>
     <w:lsdException w:name="HTML Variable" w:semiHidden="1" w:unhideWhenUsed="1"/>
+    <w:lsdException w:name="Normal Table" w:semiHidden="1" w:unhideWhenUsed="1"/>
     <w:lsdException w:name="annotation subject" w:semiHidden="1" w:unhideWhenUsed="1"/>
     <w:lsdException w:name="No List" w:semiHidden="1" w:unhideWhenUsed="1"/>
     <w:lsdException w:name="Outline List 1" w:semiHidden="1" w:unhideWhenUsed="1"/>
@@ -2219,8 +2285,11 @@
     <w:lsdException w:name="Table Contemporary" w:semiHidden="1" w:unhideWhenUsed="1"/>
     <w:lsdException w:name="Table Elegant" w:semiHidden="1" w:unhideWhenUsed="1"/>
     <w:lsdException w:name="Table Professional" w:semiHidden="1" w:unhideWhenUsed="1"/>
+    <w:lsdException w:name="Table Subtle 1" w:semiHidden="1" w:unhideWhenUsed="1"/>
     <w:lsdException w:name="Table Subtle 2" w:semiHidden="1" w:unhideWhenUsed="1"/>
     <w:lsdException w:name="Table Web 1" w:semiHidden="1" w:unhideWhenUsed="1"/>
+    <w:lsdException w:name="Table Web 2" w:semiHidden="1" w:unhideWhenUsed="1"/>
+    <w:lsdException w:name="Table Web 3" w:semiHidden="1" w:unhideWhenUsed="1"/>
     <w:lsdException w:name="Balloon Text" w:semiHidden="1" w:unhideWhenUsed="1"/>
     <w:lsdException w:name="Table Grid" w:uiPriority="59"/>
     <w:lsdException w:name="Table Theme" w:semiHidden="1" w:unhideWhenUsed="1"/>

</xml_diff>